<commit_message>
updated guides to publication
</commit_message>
<xml_diff>
--- a/reports/guides/04-Manuscript Record Form - SanJuanChinook.docx
+++ b/reports/guides/04-Manuscript Record Form - SanJuanChinook.docx
@@ -285,7 +285,7 @@
               <w:rPr>
                 <w:rFonts w:ascii="Calibri" w:eastAsia="Calibri" w:hAnsi="Calibri" w:cs="Calibri"/>
               </w:rPr>
-              <w:t xml:space="preserve">Katie H. Davidson, Jonathan Archambault, David Burt, Jessy Bokvist, </w:t>
+              <w:t xml:space="preserve">Katie H. Davidson, Jonathan Archambault, Jessy Bokvist, </w:t>
             </w:r>
             <w:r>
               <w:rPr>
@@ -5597,6 +5597,15 @@
 </file>
 
 <file path=customXml/item2.xml><?xml version="1.0" encoding="utf-8"?>
+<?mso-contentType ?>
+<FormTemplates xmlns="http://schemas.microsoft.com/sharepoint/v3/contenttype/forms">
+  <Display>DocumentLibraryForm</Display>
+  <Edit>DocumentLibraryForm</Edit>
+  <New>DocumentLibraryForm</New>
+</FormTemplates>
+</file>
+
+<file path=customXml/item3.xml><?xml version="1.0" encoding="utf-8"?>
 <p:properties xmlns:p="http://schemas.microsoft.com/office/2006/metadata/properties" xmlns:xsi="http://www.w3.org/2001/XMLSchema-instance" xmlns:pc="http://schemas.microsoft.com/office/infopath/2007/PartnerControls">
   <documentManagement>
     <lcf76f155ced4ddcb4097134ff3c332f xmlns="7234e919-b10c-4a79-95b7-9a0e2de0adc9">
@@ -5605,15 +5614,6 @@
     <TaxCatchAll xmlns="7c76acbe-e084-4ce7-86cd-5dc6c662d7d2" xsi:nil="true"/>
   </documentManagement>
 </p:properties>
-</file>
-
-<file path=customXml/item3.xml><?xml version="1.0" encoding="utf-8"?>
-<?mso-contentType ?>
-<FormTemplates xmlns="http://schemas.microsoft.com/sharepoint/v3/contenttype/forms">
-  <Display>DocumentLibraryForm</Display>
-  <Edit>DocumentLibraryForm</Edit>
-  <New>DocumentLibraryForm</New>
-</FormTemplates>
 </file>
 
 <file path=customXml/itemProps1.xml><?xml version="1.0" encoding="utf-8"?>
@@ -5636,6 +5636,14 @@
 </file>
 
 <file path=customXml/itemProps2.xml><?xml version="1.0" encoding="utf-8"?>
+<ds:datastoreItem xmlns:ds="http://schemas.openxmlformats.org/officeDocument/2006/customXml" ds:itemID="{3E47A7BF-8382-4019-A0B4-F7D92DE854DA}">
+  <ds:schemaRefs>
+    <ds:schemaRef ds:uri="http://schemas.microsoft.com/sharepoint/v3/contenttype/forms"/>
+  </ds:schemaRefs>
+</ds:datastoreItem>
+</file>
+
+<file path=customXml/itemProps3.xml><?xml version="1.0" encoding="utf-8"?>
 <ds:datastoreItem xmlns:ds="http://schemas.openxmlformats.org/officeDocument/2006/customXml" ds:itemID="{79820B00-4A78-4313-BB17-EE77538429AF}">
   <ds:schemaRefs>
     <ds:schemaRef ds:uri="http://schemas.microsoft.com/office/2006/metadata/properties"/>
@@ -5644,12 +5652,4 @@
     <ds:schemaRef ds:uri="7c76acbe-e084-4ce7-86cd-5dc6c662d7d2"/>
   </ds:schemaRefs>
 </ds:datastoreItem>
-</file>
-
-<file path=customXml/itemProps3.xml><?xml version="1.0" encoding="utf-8"?>
-<ds:datastoreItem xmlns:ds="http://schemas.openxmlformats.org/officeDocument/2006/customXml" ds:itemID="{3E47A7BF-8382-4019-A0B4-F7D92DE854DA}">
-  <ds:schemaRefs>
-    <ds:schemaRef ds:uri="http://schemas.microsoft.com/sharepoint/v3/contenttype/forms"/>
-  </ds:schemaRefs>
-</ds:datastoreItem>
 </file>
</xml_diff>